<commit_message>
Añadi el acceso de github cambie y añadi la conclusion a wcag añadi la presentacion
</commit_message>
<xml_diff>
--- a/05_Accesibilidad/Reporte_WCAG_2.1_AA.docx
+++ b/05_Accesibilidad/Reporte_WCAG_2.1_AA.docx
@@ -6,53 +6,23 @@
       <w:pPr>
         <w:pStyle w:val="Textoindependiente"/>
         <w:spacing w:line="412" w:lineRule="auto"/>
-        <w:ind w:left="262" w:right="5423"/>
-      </w:pPr>
-      <w:r>
-        <w:t xml:space="preserve">Proyecto: Queque girasol </w:t>
-      </w:r>
-      <w:r>
-        <w:rPr>
-          <w:spacing w:val="-4"/>
-        </w:rPr>
-        <w:t>Herramienta:</w:t>
-      </w:r>
-      <w:r>
-        <w:rPr>
-          <w:spacing w:val="-26"/>
-        </w:rPr>
-        <w:t xml:space="preserve"> </w:t>
-      </w:r>
-      <w:r>
-        <w:rPr>
-          <w:spacing w:val="-4"/>
-        </w:rPr>
-        <w:t>Figma</w:t>
-      </w:r>
-      <w:r>
-        <w:rPr>
-          <w:spacing w:val="-27"/>
-        </w:rPr>
-        <w:t xml:space="preserve"> </w:t>
-      </w:r>
-      <w:r>
-        <w:rPr>
-          <w:spacing w:val="-4"/>
-        </w:rPr>
-        <w:t>Web</w:t>
+        <w:ind w:left="0" w:right="5423"/>
+      </w:pPr>
+      <w:r>
+        <w:t>Proyecto: Queque girasol</w:t>
       </w:r>
     </w:p>
     <w:p>
       <w:pPr>
         <w:pStyle w:val="Textoindependiente"/>
-        <w:spacing w:before="2" w:line="412" w:lineRule="auto"/>
-        <w:ind w:left="262" w:right="5423"/>
-      </w:pPr>
-      <w:r>
-        <w:rPr>
-          <w:spacing w:val="-2"/>
-        </w:rPr>
-        <w:t>Nivel</w:t>
+        <w:spacing w:line="412" w:lineRule="auto"/>
+        <w:ind w:left="0" w:right="5423"/>
+      </w:pPr>
+      <w:r>
+        <w:rPr>
+          <w:spacing w:val="-4"/>
+        </w:rPr>
+        <w:t>Herramienta:</w:t>
       </w:r>
       <w:r>
         <w:rPr>
@@ -62,77 +32,41 @@
       </w:r>
       <w:r>
         <w:rPr>
-          <w:spacing w:val="-2"/>
-        </w:rPr>
-        <w:t>evaluado:</w:t>
-      </w:r>
-      <w:r>
-        <w:rPr>
-          <w:spacing w:val="-25"/>
+          <w:spacing w:val="-4"/>
+        </w:rPr>
+        <w:t>Figma</w:t>
+      </w:r>
+      <w:r>
+        <w:rPr>
+          <w:spacing w:val="-27"/>
         </w:rPr>
         <w:t xml:space="preserve"> </w:t>
       </w:r>
       <w:r>
         <w:rPr>
-          <w:spacing w:val="-2"/>
-        </w:rPr>
-        <w:t>WCAG</w:t>
-      </w:r>
-      <w:r>
-        <w:rPr>
-          <w:spacing w:val="-26"/>
-        </w:rPr>
-        <w:t xml:space="preserve"> </w:t>
-      </w:r>
-      <w:r>
-        <w:rPr>
-          <w:spacing w:val="-2"/>
-        </w:rPr>
-        <w:t>2.1</w:t>
-      </w:r>
-      <w:r>
-        <w:rPr>
-          <w:spacing w:val="-27"/>
-        </w:rPr>
-        <w:t xml:space="preserve"> </w:t>
-      </w:r>
-      <w:r>
-        <w:rPr>
-          <w:spacing w:val="-2"/>
-        </w:rPr>
-        <w:t xml:space="preserve">AA </w:t>
-      </w:r>
-      <w:r>
-        <w:t>Fecha:</w:t>
-      </w:r>
-      <w:r>
-        <w:rPr>
-          <w:spacing w:val="-20"/>
-        </w:rPr>
-        <w:t xml:space="preserve"> </w:t>
-      </w:r>
-      <w:r>
-        <w:t>28/06/2026</w:t>
+          <w:spacing w:val="-4"/>
+        </w:rPr>
+        <w:t>Web</w:t>
       </w:r>
     </w:p>
     <w:p>
       <w:pPr>
         <w:pStyle w:val="Textoindependiente"/>
-        <w:spacing w:before="2"/>
-        <w:ind w:left="262"/>
+        <w:spacing w:before="2" w:line="412" w:lineRule="auto"/>
+        <w:ind w:left="0" w:right="5423"/>
         <w:rPr>
           <w:spacing w:val="-2"/>
         </w:rPr>
       </w:pPr>
       <w:r>
         <w:rPr>
-          <w:spacing w:val="-5"/>
-        </w:rPr>
-        <w:t>Evaluador:</w:t>
-      </w:r>
-      <w:r>
-        <w:rPr>
-          <w:spacing w:val="-8"/>
+          <w:spacing w:val="-2"/>
+        </w:rPr>
+        <w:t>Nivel</w:t>
+      </w:r>
+      <w:r>
+        <w:rPr>
+          <w:spacing w:val="-26"/>
         </w:rPr>
         <w:t xml:space="preserve"> </w:t>
       </w:r>
@@ -140,139 +74,219 @@
         <w:rPr>
           <w:spacing w:val="-2"/>
         </w:rPr>
-        <w:t>Jafeth Espinoza villarreal</w:t>
+        <w:t>evaluado:</w:t>
+      </w:r>
+      <w:r>
+        <w:rPr>
+          <w:spacing w:val="-25"/>
+        </w:rPr>
+        <w:t xml:space="preserve"> </w:t>
+      </w:r>
+      <w:r>
+        <w:rPr>
+          <w:spacing w:val="-2"/>
+        </w:rPr>
+        <w:t>WCAG</w:t>
+      </w:r>
+      <w:r>
+        <w:rPr>
+          <w:spacing w:val="-26"/>
+        </w:rPr>
+        <w:t xml:space="preserve"> </w:t>
+      </w:r>
+      <w:r>
+        <w:rPr>
+          <w:spacing w:val="-2"/>
+        </w:rPr>
+        <w:t>2.1</w:t>
+      </w:r>
+      <w:r>
+        <w:rPr>
+          <w:spacing w:val="-27"/>
+        </w:rPr>
+        <w:t xml:space="preserve"> </w:t>
+      </w:r>
+      <w:r>
+        <w:rPr>
+          <w:spacing w:val="-2"/>
+        </w:rPr>
+        <w:t>AA</w:t>
       </w:r>
     </w:p>
     <w:p>
       <w:pPr>
         <w:pStyle w:val="Textoindependiente"/>
-        <w:spacing w:line="283" w:lineRule="auto"/>
-        <w:ind w:left="262"/>
-      </w:pPr>
-      <w:r>
-        <w:t>Evaluar</w:t>
-      </w:r>
-      <w:r>
-        <w:rPr>
-          <w:spacing w:val="-23"/>
+        <w:spacing w:before="2" w:line="412" w:lineRule="auto"/>
+        <w:ind w:left="0" w:right="5423"/>
+      </w:pPr>
+      <w:r>
+        <w:t>Fecha:</w:t>
+      </w:r>
+      <w:r>
+        <w:rPr>
+          <w:spacing w:val="-20"/>
         </w:rPr>
         <w:t xml:space="preserve"> </w:t>
       </w:r>
       <w:r>
-        <w:t>el</w:t>
-      </w:r>
-      <w:r>
-        <w:rPr>
-          <w:spacing w:val="-23"/>
-        </w:rPr>
-        <w:t xml:space="preserve"> </w:t>
-      </w:r>
-      <w:r>
-        <w:t>prototipo</w:t>
-      </w:r>
-      <w:r>
-        <w:rPr>
-          <w:spacing w:val="-23"/>
-        </w:rPr>
-        <w:t xml:space="preserve"> </w:t>
-      </w:r>
-      <w:r>
-        <w:t>web</w:t>
-      </w:r>
-      <w:r>
-        <w:rPr>
-          <w:spacing w:val="-23"/>
-        </w:rPr>
-        <w:t xml:space="preserve"> </w:t>
-      </w:r>
-      <w:r>
-        <w:t>para</w:t>
-      </w:r>
-      <w:r>
-        <w:rPr>
-          <w:spacing w:val="-23"/>
-        </w:rPr>
-        <w:t xml:space="preserve"> </w:t>
-      </w:r>
-      <w:r>
-        <w:t>verificar</w:t>
-      </w:r>
-      <w:r>
-        <w:rPr>
-          <w:spacing w:val="-23"/>
-        </w:rPr>
-        <w:t xml:space="preserve"> </w:t>
-      </w:r>
-      <w:r>
-        <w:t>su</w:t>
-      </w:r>
-      <w:r>
-        <w:rPr>
-          <w:spacing w:val="-22"/>
-        </w:rPr>
-        <w:t xml:space="preserve"> </w:t>
-      </w:r>
-      <w:r>
-        <w:t>cumplimiento</w:t>
-      </w:r>
-      <w:r>
-        <w:rPr>
-          <w:spacing w:val="-23"/>
-        </w:rPr>
-        <w:t xml:space="preserve"> </w:t>
-      </w:r>
-      <w:r>
-        <w:t>con</w:t>
-      </w:r>
-      <w:r>
-        <w:rPr>
-          <w:spacing w:val="-21"/>
-        </w:rPr>
-        <w:t xml:space="preserve"> </w:t>
-      </w:r>
-      <w:r>
-        <w:t>criterios</w:t>
-      </w:r>
-      <w:r>
-        <w:rPr>
-          <w:spacing w:val="-21"/>
-        </w:rPr>
-        <w:t xml:space="preserve"> </w:t>
-      </w:r>
-      <w:r>
-        <w:t>básicos</w:t>
-      </w:r>
-      <w:r>
-        <w:rPr>
-          <w:spacing w:val="-22"/>
-        </w:rPr>
-        <w:t xml:space="preserve"> </w:t>
-      </w:r>
-      <w:r>
-        <w:t>de accesibilidad según WCAG 2.1 AA.</w:t>
+        <w:t>28/06/2026</w:t>
       </w:r>
     </w:p>
     <w:p>
       <w:pPr>
         <w:pStyle w:val="Textoindependiente"/>
-        <w:spacing w:line="283" w:lineRule="auto"/>
-        <w:ind w:left="262"/>
-      </w:pPr>
-      <w:r>
-        <w:t>Contraste</w:t>
-      </w:r>
-      <w:r>
-        <w:t xml:space="preserve"> de color </w:t>
+        <w:spacing w:before="2"/>
+        <w:ind w:left="0"/>
+        <w:rPr>
+          <w:spacing w:val="-2"/>
+        </w:rPr>
+      </w:pPr>
+      <w:r>
+        <w:rPr>
+          <w:spacing w:val="-5"/>
+        </w:rPr>
+        <w:t>Evaluador:</w:t>
+      </w:r>
+      <w:r>
+        <w:rPr>
+          <w:spacing w:val="-8"/>
+        </w:rPr>
+        <w:t xml:space="preserve"> </w:t>
+      </w:r>
+      <w:r>
+        <w:rPr>
+          <w:spacing w:val="-2"/>
+        </w:rPr>
+        <w:t>Jafeth Espinoza villarreal</w:t>
       </w:r>
     </w:p>
     <w:p>
       <w:pPr>
         <w:pStyle w:val="Textoindependiente"/>
         <w:spacing w:line="283" w:lineRule="auto"/>
-        <w:ind w:left="262"/>
-        <w:rPr>
-          <w:rFonts w:hint="cs"/>
-        </w:rPr>
+        <w:ind w:left="0"/>
+      </w:pPr>
+      <w:r>
+        <w:t>Evaluar</w:t>
+      </w:r>
+      <w:r>
+        <w:rPr>
+          <w:spacing w:val="-23"/>
+        </w:rPr>
+        <w:t xml:space="preserve"> </w:t>
+      </w:r>
+      <w:r>
+        <w:t>el</w:t>
+      </w:r>
+      <w:r>
+        <w:rPr>
+          <w:spacing w:val="-23"/>
+        </w:rPr>
+        <w:t xml:space="preserve"> </w:t>
+      </w:r>
+      <w:r>
+        <w:t>prototipo</w:t>
+      </w:r>
+      <w:r>
+        <w:rPr>
+          <w:spacing w:val="-23"/>
+        </w:rPr>
+        <w:t xml:space="preserve"> </w:t>
+      </w:r>
+      <w:r>
+        <w:t>web</w:t>
+      </w:r>
+      <w:r>
+        <w:rPr>
+          <w:spacing w:val="-23"/>
+        </w:rPr>
+        <w:t xml:space="preserve"> </w:t>
+      </w:r>
+      <w:r>
+        <w:t>para</w:t>
+      </w:r>
+      <w:r>
+        <w:rPr>
+          <w:spacing w:val="-23"/>
+        </w:rPr>
+        <w:t xml:space="preserve"> </w:t>
+      </w:r>
+      <w:r>
+        <w:t>verificar</w:t>
+      </w:r>
+      <w:r>
+        <w:rPr>
+          <w:spacing w:val="-23"/>
+        </w:rPr>
+        <w:t xml:space="preserve"> </w:t>
+      </w:r>
+      <w:r>
+        <w:t>su</w:t>
+      </w:r>
+      <w:r>
+        <w:rPr>
+          <w:spacing w:val="-22"/>
+        </w:rPr>
+        <w:t xml:space="preserve"> </w:t>
+      </w:r>
+      <w:r>
+        <w:t>cumplimiento</w:t>
+      </w:r>
+      <w:r>
+        <w:rPr>
+          <w:spacing w:val="-23"/>
+        </w:rPr>
+        <w:t xml:space="preserve"> </w:t>
+      </w:r>
+      <w:r>
+        <w:t>con</w:t>
+      </w:r>
+      <w:r>
+        <w:rPr>
+          <w:spacing w:val="-21"/>
+        </w:rPr>
+        <w:t xml:space="preserve"> </w:t>
+      </w:r>
+      <w:r>
+        <w:t>criterios</w:t>
+      </w:r>
+      <w:r>
+        <w:rPr>
+          <w:spacing w:val="-21"/>
+        </w:rPr>
+        <w:t xml:space="preserve"> </w:t>
+      </w:r>
+      <w:r>
+        <w:t>básicos</w:t>
+      </w:r>
+      <w:r>
+        <w:rPr>
+          <w:spacing w:val="-22"/>
+        </w:rPr>
+        <w:t xml:space="preserve"> </w:t>
+      </w:r>
+      <w:r>
+        <w:t>de accesibilidad según WCAG 2.1 AA.</w:t>
+      </w:r>
+    </w:p>
+    <w:p>
+      <w:pPr>
+        <w:pStyle w:val="Textoindependiente"/>
+        <w:spacing w:line="283" w:lineRule="auto"/>
+        <w:ind w:left="0"/>
+      </w:pPr>
+      <w:r>
+        <w:t>Contraste</w:t>
+      </w:r>
+      <w:r>
+        <w:t xml:space="preserve"> de color </w:t>
+      </w:r>
+    </w:p>
+    <w:p>
+      <w:pPr>
+        <w:pStyle w:val="Textoindependiente"/>
+        <w:spacing w:line="283" w:lineRule="auto"/>
+        <w:ind w:left="0"/>
       </w:pPr>
       <w:r>
         <w:rPr>
@@ -450,14 +464,7 @@
                 <w:sz w:val="24"/>
                 <w:szCs w:val="24"/>
               </w:rPr>
-              <w:t>7.93</w:t>
-            </w:r>
-            <w:r>
-              <w:rPr>
-                <w:sz w:val="24"/>
-                <w:szCs w:val="24"/>
-              </w:rPr>
-              <w:t>:1</w:t>
+              <w:t>7.93:1</w:t>
             </w:r>
             <w:r>
               <w:rPr>
@@ -814,7 +821,7 @@
         <w:rPr>
           <w:lang w:val="es-CR"/>
         </w:rPr>
-        <w:t xml:space="preserve"> </w:t>
+        <w:t>.</w:t>
       </w:r>
     </w:p>
     <w:p>
@@ -862,7 +869,13 @@
         <w:rPr>
           <w:lang w:val="es-CR"/>
         </w:rPr>
-        <w:t xml:space="preserve">Los textos son legibles y mantienen sus tamaños es sus respectivas vistas sus tamaños pueden variar entre vistas </w:t>
+        <w:t>Los textos son legibles y mantienen sus tamaños es sus respectivas vistas sus tamaños pueden variar entre vistas</w:t>
+      </w:r>
+      <w:r>
+        <w:rPr>
+          <w:lang w:val="es-CR"/>
+        </w:rPr>
+        <w:t>.</w:t>
       </w:r>
     </w:p>
     <w:p>
@@ -912,6 +925,12 @@
         </w:rPr>
         <w:t xml:space="preserve">Cumple con los requerimientos de un formulario </w:t>
       </w:r>
+      <w:r>
+        <w:rPr>
+          <w:lang w:val="es-CR"/>
+        </w:rPr>
+        <w:t>y se comprende lo que se pide en las diferentes secciones de este.</w:t>
+      </w:r>
     </w:p>
     <w:p>
       <w:pPr>
@@ -936,7 +955,6 @@
         <w:rPr>
           <w:lang w:val="es-CR"/>
         </w:rPr>
-        <w:lastRenderedPageBreak/>
         <w:t xml:space="preserve">Responsive: </w:t>
       </w:r>
     </w:p>
@@ -977,6 +995,12 @@
         </w:rPr>
         <w:t>que no cabían en esta parte</w:t>
       </w:r>
+      <w:r>
+        <w:rPr>
+          <w:lang w:val="es-CR"/>
+        </w:rPr>
+        <w:t>.</w:t>
+      </w:r>
     </w:p>
     <w:p>
       <w:pPr>
@@ -1063,6 +1087,12 @@
           <w:spacing w:val="-2"/>
         </w:rPr>
         <w:t xml:space="preserve"> en si no tiene ningún problema</w:t>
+      </w:r>
+      <w:r>
+        <w:rPr>
+          <w:spacing w:val="-2"/>
+        </w:rPr>
+        <w:t>.</w:t>
       </w:r>
     </w:p>
     <w:p>
@@ -1525,6 +1555,12 @@
               </w:rPr>
               <w:t>consistente</w:t>
             </w:r>
+            <w:r>
+              <w:rPr>
+                <w:spacing w:val="-4"/>
+              </w:rPr>
+              <w:t xml:space="preserve"> y con sentido</w:t>
+            </w:r>
           </w:p>
         </w:tc>
         <w:tc>
@@ -1716,16 +1752,29 @@
     <w:p>
       <w:pPr>
         <w:pStyle w:val="Textoindependiente"/>
-        <w:spacing w:before="2"/>
-        <w:ind w:left="262"/>
+        <w:spacing w:before="169"/>
+        <w:ind w:left="0"/>
       </w:pPr>
     </w:p>
     <w:p>
       <w:pPr>
         <w:pStyle w:val="Textoindependiente"/>
         <w:spacing w:before="169"/>
-        <w:ind w:left="262"/>
-      </w:pPr>
+        <w:ind w:left="0"/>
+      </w:pPr>
+      <w:r>
+        <w:t>Conclusión:</w:t>
+      </w:r>
+    </w:p>
+    <w:p>
+      <w:pPr>
+        <w:pStyle w:val="Textoindependiente"/>
+        <w:spacing w:before="169"/>
+        <w:ind w:left="0"/>
+      </w:pPr>
+      <w:r>
+        <w:t>El proyecto cumple con los requerimientos y criterios que se le imponen en el WCAG2.1 AA que fueron revisados varias veces para no cometer errores graves.</w:t>
+      </w:r>
     </w:p>
     <w:p>
       <w:pPr>
@@ -2523,6 +2572,7 @@
   <w:style w:type="character" w:default="1" w:styleId="Fuentedeprrafopredeter">
     <w:name w:val="Default Paragraph Font"/>
     <w:uiPriority w:val="1"/>
+    <w:semiHidden/>
     <w:unhideWhenUsed/>
   </w:style>
   <w:style w:type="table" w:default="1" w:styleId="Tablanormal">

</xml_diff>